<commit_message>
review uploading file to s3 (bug)
</commit_message>
<xml_diff>
--- a/Meeting_Minutes_12-02-2026.docx
+++ b/Meeting_Minutes_12-02-2026.docx
@@ -197,7 +197,19 @@
           </w:tcPr>
           <w:p>
             <w:r>
-              <w:t>Agenda approved (Brown motion, Hobbs second).</w:t>
+              <w:t>Meeting called to order by Chairman Wormsley.</w:t>
+            </w:r>
+          </w:p>
+        </w:tc>
+      </w:tr>
+      <w:tr>
+        <w:tc>
+          <w:tcPr>
+            <w:tcW w:type="dxa" w:w="8640"/>
+          </w:tcPr>
+          <w:p>
+            <w:r>
+              <w:t>Agenda approved (motion by Commissioner Brown, seconded by Commissioner Hobbs).</w:t>
             </w:r>
           </w:p>
         </w:tc>
@@ -221,7 +233,7 @@
           </w:tcPr>
           <w:p>
             <w:r>
-              <w:t>Laptop purchase resolution approved (Adkins motion, Carmical second).</w:t>
+              <w:t>Resolution for laptop purchase approved (motion by Commissioner Adkins, seconded by Commissioner Carmical).</w:t>
             </w:r>
           </w:p>
         </w:tc>
@@ -233,7 +245,7 @@
           </w:tcPr>
           <w:p>
             <w:r>
-              <w:t>Motion to withdraw airport property sale (Commissioner McKee).</w:t>
+              <w:t>Commissioner McKee withdrew motion to sell airport property.</w:t>
             </w:r>
           </w:p>
         </w:tc>
@@ -245,7 +257,7 @@
           </w:tcPr>
           <w:p>
             <w:r>
-              <w:t>Litigation tax increase discussion: Sheriff opposed (Commissioner Duckett). Amendment to allocate 25% of criminal case proceeds to Sheriff's Dept. passed (Duckett motion, Malone second).</w:t>
+              <w:t>Litigation tax increase resolution discussed; amendment proposed by Commissioner Duckett (seconded by Commissioner Malone) to allocate 25% of criminal case proceeds to the sheriff's department – amendment passed (17-2).</w:t>
             </w:r>
           </w:p>
         </w:tc>
@@ -257,7 +269,7 @@
           </w:tcPr>
           <w:p>
             <w:r>
-              <w:t>Roll call vote on litigation tax increase failed.</w:t>
+              <w:t>Final vote on litigation tax increase failed (9-9-1).</w:t>
             </w:r>
           </w:p>
         </w:tc>
@@ -269,7 +281,7 @@
           </w:tcPr>
           <w:p>
             <w:r>
-              <w:t>Wheel tax increase resolution introduced (Adkins motion, Thompson second).</w:t>
+              <w:t>Wheel tax increase resolution introduced (motion by Commissioner Adkins, seconded by Commissioner Thompson).</w:t>
             </w:r>
           </w:p>
         </w:tc>
@@ -281,7 +293,7 @@
           </w:tcPr>
           <w:p>
             <w:r>
-              <w:t>Motion for previous question passed (Hayes motion, Crenshaw second), cutting off debate.</w:t>
+              <w:t>Motion for previous question passed (17-2) – cutting off debate on wheel tax.</w:t>
             </w:r>
           </w:p>
         </w:tc>
@@ -293,7 +305,19 @@
           </w:tcPr>
           <w:p>
             <w:r>
-              <w:t>Wheel tax increase passed on first passage.</w:t>
+              <w:t>Wheel tax increase passed on first passage (17-2).</w:t>
+            </w:r>
+          </w:p>
+        </w:tc>
+      </w:tr>
+      <w:tr>
+        <w:tc>
+          <w:tcPr>
+            <w:tcW w:type="dxa" w:w="8640"/>
+          </w:tcPr>
+          <w:p>
+            <w:r>
+              <w:t>Meeting adjourned (motion by Commissioner Austin, seconded by Commissioner Garland).</w:t>
             </w:r>
           </w:p>
         </w:tc>
@@ -309,7 +333,7 @@
     </w:p>
     <w:p>
       <w:r>
-        <w:t>The CTAS County Commission addressed several resolutions, including funding for a laptop, increasing litigation taxes, and increasing the wheel tax.</w:t>
+        <w:t>The commission addressed several resolutions, including funding for a laptop, increases to litigation and wheel taxes, and a withdrawn motion regarding property sale.</w:t>
       </w:r>
     </w:p>
     <w:sectPr>

</xml_diff>